<commit_message>
Fix table 5.1 structure: revenue in name row, qty in count row, unit price in cost row
По требованию Рязанской комиссии структура таблицы 5.1:
- Строка А (название услуги): выручка услуги за месяц (Q*P), ИТОГО = годовая выручка, Доля %
- Строка Б (количество): число заказов в месяц, ИТОГО = годовое количество
- Строка В (стоимость): цена за единицу из прайса (константа 10000/14000/5000/3500/3000), ИТОГО пусто, Доля % пусто

Контроль: суммы выручки по строке 'Доходы всего' = 876 500 руб., доли услуг = 100%.
</commit_message>
<xml_diff>
--- a/Бизнес план Воробьев Павел Алексеевич FIX.docx
+++ b/Бизнес план Воробьев Павел Алексеевич FIX.docx
@@ -10259,6 +10259,9 @@
                 <w:szCs w:val="22"/>
               </w:rPr>
             </w:pPr>
+            <w:r>
+              <w:t>0</w:t>
+            </w:r>
           </w:p>
         </w:tc>
         <w:tc>
@@ -10283,6 +10286,9 @@
                 <w:szCs w:val="22"/>
               </w:rPr>
             </w:pPr>
+            <w:r>
+              <w:t>90 000</w:t>
+            </w:r>
           </w:p>
         </w:tc>
         <w:tc>
@@ -10307,6 +10313,9 @@
                 <w:szCs w:val="22"/>
               </w:rPr>
             </w:pPr>
+            <w:r>
+              <w:t>110 000</w:t>
+            </w:r>
           </w:p>
         </w:tc>
         <w:tc>
@@ -10331,6 +10340,9 @@
                 <w:szCs w:val="22"/>
               </w:rPr>
             </w:pPr>
+            <w:r>
+              <w:t>80 000</w:t>
+            </w:r>
           </w:p>
         </w:tc>
         <w:tc>
@@ -10355,6 +10367,9 @@
                 <w:szCs w:val="22"/>
               </w:rPr>
             </w:pPr>
+            <w:r>
+              <w:t>50 000</w:t>
+            </w:r>
           </w:p>
         </w:tc>
         <w:tc>
@@ -10379,6 +10394,9 @@
                 <w:szCs w:val="22"/>
               </w:rPr>
             </w:pPr>
+            <w:r>
+              <w:t>20 000</w:t>
+            </w:r>
           </w:p>
         </w:tc>
         <w:tc>
@@ -10403,6 +10421,9 @@
                 <w:szCs w:val="22"/>
               </w:rPr>
             </w:pPr>
+            <w:r>
+              <w:t>10 000</w:t>
+            </w:r>
           </w:p>
         </w:tc>
         <w:tc>
@@ -10427,6 +10448,9 @@
                 <w:szCs w:val="22"/>
               </w:rPr>
             </w:pPr>
+            <w:r>
+              <w:t>0</w:t>
+            </w:r>
           </w:p>
         </w:tc>
         <w:tc>
@@ -10451,6 +10475,9 @@
                 <w:szCs w:val="22"/>
               </w:rPr>
             </w:pPr>
+            <w:r>
+              <w:t>0</w:t>
+            </w:r>
           </w:p>
         </w:tc>
         <w:tc>
@@ -10475,6 +10502,9 @@
                 <w:szCs w:val="22"/>
               </w:rPr>
             </w:pPr>
+            <w:r>
+              <w:t>0</w:t>
+            </w:r>
           </w:p>
         </w:tc>
         <w:tc>
@@ -10499,6 +10529,9 @@
                 <w:szCs w:val="22"/>
               </w:rPr>
             </w:pPr>
+            <w:r>
+              <w:t>40 000</w:t>
+            </w:r>
           </w:p>
         </w:tc>
         <w:tc>
@@ -10523,6 +10556,9 @@
                 <w:szCs w:val="22"/>
               </w:rPr>
             </w:pPr>
+            <w:r>
+              <w:t>50 000</w:t>
+            </w:r>
           </w:p>
         </w:tc>
         <w:tc>
@@ -10547,6 +10583,15 @@
                 <w:szCs w:val="22"/>
               </w:rPr>
             </w:pPr>
+            <w:r>
+              <w:rPr>
+                <w:b/>
+              </w:rPr>
+              <w:rPr>
+                <w:b/>
+              </w:rPr>
+              <w:t>450 000</w:t>
+            </w:r>
           </w:p>
         </w:tc>
         <w:tc>
@@ -10571,6 +10616,9 @@
                 <w:szCs w:val="22"/>
               </w:rPr>
             </w:pPr>
+            <w:r>
+              <w:t>51,3</w:t>
+            </w:r>
           </w:p>
         </w:tc>
       </w:tr>
@@ -11096,7 +11144,7 @@
               </w:rPr>
             </w:pPr>
             <w:r>
-              <w:t>0</w:t>
+              <w:t>10 000</w:t>
             </w:r>
           </w:p>
         </w:tc>
@@ -11123,7 +11171,7 @@
               </w:rPr>
             </w:pPr>
             <w:r>
-              <w:t>90 000</w:t>
+              <w:t>10 000</w:t>
             </w:r>
           </w:p>
         </w:tc>
@@ -11150,7 +11198,7 @@
               </w:rPr>
             </w:pPr>
             <w:r>
-              <w:t>110 000</w:t>
+              <w:t>10 000</w:t>
             </w:r>
           </w:p>
         </w:tc>
@@ -11177,7 +11225,7 @@
               </w:rPr>
             </w:pPr>
             <w:r>
-              <w:t>80 000</w:t>
+              <w:t>10 000</w:t>
             </w:r>
           </w:p>
         </w:tc>
@@ -11204,7 +11252,7 @@
               </w:rPr>
             </w:pPr>
             <w:r>
-              <w:t>50 000</w:t>
+              <w:t>10 000</w:t>
             </w:r>
           </w:p>
         </w:tc>
@@ -11231,7 +11279,7 @@
               </w:rPr>
             </w:pPr>
             <w:r>
-              <w:t>20 000</w:t>
+              <w:t>10 000</w:t>
             </w:r>
           </w:p>
         </w:tc>
@@ -11285,7 +11333,7 @@
               </w:rPr>
             </w:pPr>
             <w:r>
-              <w:t>0</w:t>
+              <w:t>10 000</w:t>
             </w:r>
           </w:p>
         </w:tc>
@@ -11312,7 +11360,7 @@
               </w:rPr>
             </w:pPr>
             <w:r>
-              <w:t>0</w:t>
+              <w:t>10 000</w:t>
             </w:r>
           </w:p>
         </w:tc>
@@ -11339,7 +11387,7 @@
               </w:rPr>
             </w:pPr>
             <w:r>
-              <w:t>0</w:t>
+              <w:t>10 000</w:t>
             </w:r>
           </w:p>
         </w:tc>
@@ -11366,7 +11414,7 @@
               </w:rPr>
             </w:pPr>
             <w:r>
-              <w:t>40 000</w:t>
+              <w:t>10 000</w:t>
             </w:r>
           </w:p>
         </w:tc>
@@ -11393,7 +11441,7 @@
               </w:rPr>
             </w:pPr>
             <w:r>
-              <w:t>50 000</w:t>
+              <w:t>10 000</w:t>
             </w:r>
           </w:p>
         </w:tc>
@@ -11420,13 +11468,7 @@
               </w:rPr>
             </w:pPr>
             <w:r>
-              <w:rPr>
-                <w:b/>
-              </w:rPr>
-              <w:rPr>
-                <w:b/>
-              </w:rPr>
-              <w:t>450 000</w:t>
+              <w:t/>
             </w:r>
           </w:p>
         </w:tc>
@@ -11453,7 +11495,7 @@
               </w:rPr>
             </w:pPr>
             <w:r>
-              <w:t>51,3</w:t>
+              <w:t/>
             </w:r>
           </w:p>
         </w:tc>
@@ -11543,6 +11585,9 @@
                 <w:szCs w:val="22"/>
               </w:rPr>
             </w:pPr>
+            <w:r>
+              <w:t>0</w:t>
+            </w:r>
           </w:p>
         </w:tc>
         <w:tc>
@@ -11567,6 +11612,9 @@
                 <w:szCs w:val="22"/>
               </w:rPr>
             </w:pPr>
+            <w:r>
+              <w:t>14 000</w:t>
+            </w:r>
           </w:p>
         </w:tc>
         <w:tc>
@@ -11591,6 +11639,9 @@
                 <w:szCs w:val="22"/>
               </w:rPr>
             </w:pPr>
+            <w:r>
+              <w:t>14 000</w:t>
+            </w:r>
           </w:p>
         </w:tc>
         <w:tc>
@@ -11615,6 +11666,9 @@
                 <w:szCs w:val="22"/>
               </w:rPr>
             </w:pPr>
+            <w:r>
+              <w:t>28 000</w:t>
+            </w:r>
           </w:p>
         </w:tc>
         <w:tc>
@@ -11639,6 +11693,9 @@
                 <w:szCs w:val="22"/>
               </w:rPr>
             </w:pPr>
+            <w:r>
+              <w:t>28 000</w:t>
+            </w:r>
           </w:p>
         </w:tc>
         <w:tc>
@@ -11663,6 +11720,9 @@
                 <w:szCs w:val="22"/>
               </w:rPr>
             </w:pPr>
+            <w:r>
+              <w:t>28 000</w:t>
+            </w:r>
           </w:p>
         </w:tc>
         <w:tc>
@@ -11687,6 +11747,9 @@
                 <w:szCs w:val="22"/>
               </w:rPr>
             </w:pPr>
+            <w:r>
+              <w:t>28 000</w:t>
+            </w:r>
           </w:p>
         </w:tc>
         <w:tc>
@@ -11711,6 +11774,9 @@
                 <w:szCs w:val="22"/>
               </w:rPr>
             </w:pPr>
+            <w:r>
+              <w:t>28 000</w:t>
+            </w:r>
           </w:p>
         </w:tc>
         <w:tc>
@@ -11735,6 +11801,9 @@
                 <w:szCs w:val="22"/>
               </w:rPr>
             </w:pPr>
+            <w:r>
+              <w:t>14 000</w:t>
+            </w:r>
           </w:p>
         </w:tc>
         <w:tc>
@@ -11759,6 +11828,9 @@
                 <w:szCs w:val="22"/>
               </w:rPr>
             </w:pPr>
+            <w:r>
+              <w:t>14 000</w:t>
+            </w:r>
           </w:p>
         </w:tc>
         <w:tc>
@@ -11783,6 +11855,9 @@
                 <w:szCs w:val="22"/>
               </w:rPr>
             </w:pPr>
+            <w:r>
+              <w:t>28 000</w:t>
+            </w:r>
           </w:p>
         </w:tc>
         <w:tc>
@@ -11807,6 +11882,9 @@
                 <w:szCs w:val="22"/>
               </w:rPr>
             </w:pPr>
+            <w:r>
+              <w:t>28 000</w:t>
+            </w:r>
           </w:p>
         </w:tc>
         <w:tc>
@@ -11831,6 +11909,15 @@
                 <w:szCs w:val="22"/>
               </w:rPr>
             </w:pPr>
+            <w:r>
+              <w:rPr>
+                <w:b/>
+              </w:rPr>
+              <w:rPr>
+                <w:b/>
+              </w:rPr>
+              <w:t>252 000</w:t>
+            </w:r>
           </w:p>
         </w:tc>
         <w:tc>
@@ -11855,6 +11942,9 @@
                 <w:szCs w:val="22"/>
               </w:rPr>
             </w:pPr>
+            <w:r>
+              <w:t>28,8</w:t>
+            </w:r>
           </w:p>
         </w:tc>
       </w:tr>
@@ -12378,7 +12468,7 @@
               </w:rPr>
             </w:pPr>
             <w:r>
-              <w:t>0</w:t>
+              <w:t>14 000</w:t>
             </w:r>
           </w:p>
         </w:tc>
@@ -12459,7 +12549,7 @@
               </w:rPr>
             </w:pPr>
             <w:r>
-              <w:t>28 000</w:t>
+              <w:t>14 000</w:t>
             </w:r>
           </w:p>
         </w:tc>
@@ -12486,7 +12576,7 @@
               </w:rPr>
             </w:pPr>
             <w:r>
-              <w:t>28 000</w:t>
+              <w:t>14 000</w:t>
             </w:r>
           </w:p>
         </w:tc>
@@ -12513,7 +12603,7 @@
               </w:rPr>
             </w:pPr>
             <w:r>
-              <w:t>28 000</w:t>
+              <w:t>14 000</w:t>
             </w:r>
           </w:p>
         </w:tc>
@@ -12540,7 +12630,7 @@
               </w:rPr>
             </w:pPr>
             <w:r>
-              <w:t>28 000</w:t>
+              <w:t>14 000</w:t>
             </w:r>
           </w:p>
         </w:tc>
@@ -12567,7 +12657,7 @@
               </w:rPr>
             </w:pPr>
             <w:r>
-              <w:t>28 000</w:t>
+              <w:t>14 000</w:t>
             </w:r>
           </w:p>
         </w:tc>
@@ -12648,7 +12738,7 @@
               </w:rPr>
             </w:pPr>
             <w:r>
-              <w:t>28 000</w:t>
+              <w:t>14 000</w:t>
             </w:r>
           </w:p>
         </w:tc>
@@ -12675,7 +12765,7 @@
               </w:rPr>
             </w:pPr>
             <w:r>
-              <w:t>28 000</w:t>
+              <w:t>14 000</w:t>
             </w:r>
           </w:p>
         </w:tc>
@@ -12702,13 +12792,7 @@
               </w:rPr>
             </w:pPr>
             <w:r>
-              <w:rPr>
-                <w:b/>
-              </w:rPr>
-              <w:rPr>
-                <w:b/>
-              </w:rPr>
-              <w:t>252 000</w:t>
+              <w:t/>
             </w:r>
           </w:p>
         </w:tc>
@@ -12735,7 +12819,7 @@
               </w:rPr>
             </w:pPr>
             <w:r>
-              <w:t>28,8</w:t>
+              <w:t/>
             </w:r>
           </w:p>
         </w:tc>
@@ -12827,6 +12911,9 @@
                 <w:szCs w:val="22"/>
               </w:rPr>
             </w:pPr>
+            <w:r>
+              <w:t>0</w:t>
+            </w:r>
           </w:p>
         </w:tc>
         <w:tc>
@@ -12849,6 +12936,9 @@
                 <w:szCs w:val="22"/>
               </w:rPr>
             </w:pPr>
+            <w:r>
+              <w:t>10 000</w:t>
+            </w:r>
           </w:p>
         </w:tc>
         <w:tc>
@@ -12871,6 +12961,9 @@
                 <w:szCs w:val="22"/>
               </w:rPr>
             </w:pPr>
+            <w:r>
+              <w:t>10 000</w:t>
+            </w:r>
           </w:p>
         </w:tc>
         <w:tc>
@@ -12893,6 +12986,9 @@
                 <w:szCs w:val="22"/>
               </w:rPr>
             </w:pPr>
+            <w:r>
+              <w:t>10 000</w:t>
+            </w:r>
           </w:p>
         </w:tc>
         <w:tc>
@@ -12915,6 +13011,9 @@
                 <w:szCs w:val="22"/>
               </w:rPr>
             </w:pPr>
+            <w:r>
+              <w:t>10 000</w:t>
+            </w:r>
           </w:p>
         </w:tc>
         <w:tc>
@@ -12937,6 +13036,9 @@
                 <w:szCs w:val="22"/>
               </w:rPr>
             </w:pPr>
+            <w:r>
+              <w:t>10 000</w:t>
+            </w:r>
           </w:p>
         </w:tc>
         <w:tc>
@@ -12959,6 +13061,9 @@
                 <w:szCs w:val="22"/>
               </w:rPr>
             </w:pPr>
+            <w:r>
+              <w:t>5 000</w:t>
+            </w:r>
           </w:p>
         </w:tc>
         <w:tc>
@@ -12981,6 +13086,9 @@
                 <w:szCs w:val="22"/>
               </w:rPr>
             </w:pPr>
+            <w:r>
+              <w:t>5 000</w:t>
+            </w:r>
           </w:p>
         </w:tc>
         <w:tc>
@@ -13003,6 +13111,9 @@
                 <w:szCs w:val="22"/>
               </w:rPr>
             </w:pPr>
+            <w:r>
+              <w:t>5 000</w:t>
+            </w:r>
           </w:p>
         </w:tc>
         <w:tc>
@@ -13025,6 +13136,9 @@
                 <w:szCs w:val="22"/>
               </w:rPr>
             </w:pPr>
+            <w:r>
+              <w:t>5 000</w:t>
+            </w:r>
           </w:p>
         </w:tc>
         <w:tc>
@@ -13047,6 +13161,9 @@
                 <w:szCs w:val="22"/>
               </w:rPr>
             </w:pPr>
+            <w:r>
+              <w:t>15 000</w:t>
+            </w:r>
           </w:p>
         </w:tc>
         <w:tc>
@@ -13069,6 +13186,9 @@
                 <w:szCs w:val="22"/>
               </w:rPr>
             </w:pPr>
+            <w:r>
+              <w:t>15 000</w:t>
+            </w:r>
           </w:p>
         </w:tc>
         <w:tc>
@@ -13091,6 +13211,15 @@
                 <w:szCs w:val="22"/>
               </w:rPr>
             </w:pPr>
+            <w:r>
+              <w:rPr>
+                <w:b/>
+              </w:rPr>
+              <w:rPr>
+                <w:b/>
+              </w:rPr>
+              <w:t>100 000</w:t>
+            </w:r>
           </w:p>
         </w:tc>
         <w:tc>
@@ -13113,6 +13242,9 @@
                 <w:szCs w:val="22"/>
               </w:rPr>
             </w:pPr>
+            <w:r>
+              <w:t>11,4</w:t>
+            </w:r>
           </w:p>
         </w:tc>
       </w:tr>
@@ -13602,7 +13734,7 @@
               </w:rPr>
             </w:pPr>
             <w:r>
-              <w:t>0</w:t>
+              <w:t>5 000</w:t>
             </w:r>
           </w:p>
         </w:tc>
@@ -13627,7 +13759,7 @@
               </w:rPr>
             </w:pPr>
             <w:r>
-              <w:t>10 000</w:t>
+              <w:t>5 000</w:t>
             </w:r>
           </w:p>
         </w:tc>
@@ -13652,7 +13784,7 @@
               </w:rPr>
             </w:pPr>
             <w:r>
-              <w:t>10 000</w:t>
+              <w:t>5 000</w:t>
             </w:r>
           </w:p>
         </w:tc>
@@ -13677,7 +13809,7 @@
               </w:rPr>
             </w:pPr>
             <w:r>
-              <w:t>10 000</w:t>
+              <w:t>5 000</w:t>
             </w:r>
           </w:p>
         </w:tc>
@@ -13702,7 +13834,7 @@
               </w:rPr>
             </w:pPr>
             <w:r>
-              <w:t>10 000</w:t>
+              <w:t>5 000</w:t>
             </w:r>
           </w:p>
         </w:tc>
@@ -13727,7 +13859,7 @@
               </w:rPr>
             </w:pPr>
             <w:r>
-              <w:t>10 000</w:t>
+              <w:t>5 000</w:t>
             </w:r>
           </w:p>
         </w:tc>
@@ -13852,7 +13984,7 @@
               </w:rPr>
             </w:pPr>
             <w:r>
-              <w:t>15 000</w:t>
+              <w:t>5 000</w:t>
             </w:r>
           </w:p>
         </w:tc>
@@ -13877,7 +14009,7 @@
               </w:rPr>
             </w:pPr>
             <w:r>
-              <w:t>15 000</w:t>
+              <w:t>5 000</w:t>
             </w:r>
           </w:p>
         </w:tc>
@@ -13902,13 +14034,7 @@
               </w:rPr>
             </w:pPr>
             <w:r>
-              <w:rPr>
-                <w:b/>
-              </w:rPr>
-              <w:rPr>
-                <w:b/>
-              </w:rPr>
-              <w:t>100 000</w:t>
+              <w:t/>
             </w:r>
           </w:p>
         </w:tc>
@@ -13933,7 +14059,7 @@
               </w:rPr>
             </w:pPr>
             <w:r>
-              <w:t>11,4</w:t>
+              <w:t/>
             </w:r>
           </w:p>
         </w:tc>
@@ -14026,6 +14152,9 @@
                 <w:szCs w:val="22"/>
               </w:rPr>
             </w:pPr>
+            <w:r>
+              <w:t>0</w:t>
+            </w:r>
           </w:p>
         </w:tc>
         <w:tc>
@@ -14048,6 +14177,9 @@
                 <w:szCs w:val="22"/>
               </w:rPr>
             </w:pPr>
+            <w:r>
+              <w:t>3 500</w:t>
+            </w:r>
           </w:p>
         </w:tc>
         <w:tc>
@@ -14070,6 +14202,9 @@
                 <w:szCs w:val="22"/>
               </w:rPr>
             </w:pPr>
+            <w:r>
+              <w:t>3 500</w:t>
+            </w:r>
           </w:p>
         </w:tc>
         <w:tc>
@@ -14092,6 +14227,9 @@
                 <w:szCs w:val="22"/>
               </w:rPr>
             </w:pPr>
+            <w:r>
+              <w:t>3 500</w:t>
+            </w:r>
           </w:p>
         </w:tc>
         <w:tc>
@@ -14114,6 +14252,9 @@
                 <w:szCs w:val="22"/>
               </w:rPr>
             </w:pPr>
+            <w:r>
+              <w:t>3 500</w:t>
+            </w:r>
           </w:p>
         </w:tc>
         <w:tc>
@@ -14136,6 +14277,9 @@
                 <w:szCs w:val="22"/>
               </w:rPr>
             </w:pPr>
+            <w:r>
+              <w:t>3 500</w:t>
+            </w:r>
           </w:p>
         </w:tc>
         <w:tc>
@@ -14158,6 +14302,9 @@
                 <w:szCs w:val="22"/>
               </w:rPr>
             </w:pPr>
+            <w:r>
+              <w:t>3 500</w:t>
+            </w:r>
           </w:p>
         </w:tc>
         <w:tc>
@@ -14180,6 +14327,9 @@
                 <w:szCs w:val="22"/>
               </w:rPr>
             </w:pPr>
+            <w:r>
+              <w:t>3 500</w:t>
+            </w:r>
           </w:p>
         </w:tc>
         <w:tc>
@@ -14202,6 +14352,9 @@
                 <w:szCs w:val="22"/>
               </w:rPr>
             </w:pPr>
+            <w:r>
+              <w:t>0</w:t>
+            </w:r>
           </w:p>
         </w:tc>
         <w:tc>
@@ -14224,6 +14377,9 @@
                 <w:szCs w:val="22"/>
               </w:rPr>
             </w:pPr>
+            <w:r>
+              <w:t>3 500</w:t>
+            </w:r>
           </w:p>
         </w:tc>
         <w:tc>
@@ -14246,6 +14402,9 @@
                 <w:szCs w:val="22"/>
               </w:rPr>
             </w:pPr>
+            <w:r>
+              <w:t>7 000</w:t>
+            </w:r>
           </w:p>
         </w:tc>
         <w:tc>
@@ -14268,6 +14427,9 @@
                 <w:szCs w:val="22"/>
               </w:rPr>
             </w:pPr>
+            <w:r>
+              <w:t>3 500</w:t>
+            </w:r>
           </w:p>
         </w:tc>
         <w:tc>
@@ -14290,6 +14452,15 @@
                 <w:szCs w:val="22"/>
               </w:rPr>
             </w:pPr>
+            <w:r>
+              <w:rPr>
+                <w:b/>
+              </w:rPr>
+              <w:rPr>
+                <w:b/>
+              </w:rPr>
+              <w:t>38 500</w:t>
+            </w:r>
           </w:p>
         </w:tc>
         <w:tc>
@@ -14312,6 +14483,9 @@
                 <w:szCs w:val="22"/>
               </w:rPr>
             </w:pPr>
+            <w:r>
+              <w:t>4,4</w:t>
+            </w:r>
           </w:p>
         </w:tc>
       </w:tr>
@@ -14801,7 +14975,7 @@
               </w:rPr>
             </w:pPr>
             <w:r>
-              <w:t>0</w:t>
+              <w:t>3 500</w:t>
             </w:r>
           </w:p>
         </w:tc>
@@ -15001,7 +15175,7 @@
               </w:rPr>
             </w:pPr>
             <w:r>
-              <w:t>0</w:t>
+              <w:t>3 500</w:t>
             </w:r>
           </w:p>
         </w:tc>
@@ -15051,7 +15225,7 @@
               </w:rPr>
             </w:pPr>
             <w:r>
-              <w:t>7 000</w:t>
+              <w:t>3 500</w:t>
             </w:r>
           </w:p>
         </w:tc>
@@ -15101,13 +15275,7 @@
               </w:rPr>
             </w:pPr>
             <w:r>
-              <w:rPr>
-                <w:b/>
-              </w:rPr>
-              <w:rPr>
-                <w:b/>
-              </w:rPr>
-              <w:t>38 500</w:t>
+              <w:t/>
             </w:r>
           </w:p>
         </w:tc>
@@ -15132,7 +15300,7 @@
               </w:rPr>
             </w:pPr>
             <w:r>
-              <w:t>4,4</w:t>
+              <w:t/>
             </w:r>
           </w:p>
         </w:tc>
@@ -15224,6 +15392,9 @@
                 <w:szCs w:val="22"/>
               </w:rPr>
             </w:pPr>
+            <w:r>
+              <w:t>0</w:t>
+            </w:r>
           </w:p>
         </w:tc>
         <w:tc>
@@ -15246,6 +15417,9 @@
                 <w:szCs w:val="22"/>
               </w:rPr>
             </w:pPr>
+            <w:r>
+              <w:t>0</w:t>
+            </w:r>
           </w:p>
         </w:tc>
         <w:tc>
@@ -15268,6 +15442,9 @@
                 <w:szCs w:val="22"/>
               </w:rPr>
             </w:pPr>
+            <w:r>
+              <w:t>0</w:t>
+            </w:r>
           </w:p>
         </w:tc>
         <w:tc>
@@ -15290,6 +15467,9 @@
                 <w:szCs w:val="22"/>
               </w:rPr>
             </w:pPr>
+            <w:r>
+              <w:t>0</w:t>
+            </w:r>
           </w:p>
         </w:tc>
         <w:tc>
@@ -15312,6 +15492,9 @@
                 <w:szCs w:val="22"/>
               </w:rPr>
             </w:pPr>
+            <w:r>
+              <w:t>3 000</w:t>
+            </w:r>
           </w:p>
         </w:tc>
         <w:tc>
@@ -15334,6 +15517,9 @@
                 <w:szCs w:val="22"/>
               </w:rPr>
             </w:pPr>
+            <w:r>
+              <w:t>6 000</w:t>
+            </w:r>
           </w:p>
         </w:tc>
         <w:tc>
@@ -15356,6 +15542,9 @@
                 <w:szCs w:val="22"/>
               </w:rPr>
             </w:pPr>
+            <w:r>
+              <w:t>6 000</w:t>
+            </w:r>
           </w:p>
         </w:tc>
         <w:tc>
@@ -15378,6 +15567,9 @@
                 <w:szCs w:val="22"/>
               </w:rPr>
             </w:pPr>
+            <w:r>
+              <w:t>3 000</w:t>
+            </w:r>
           </w:p>
         </w:tc>
         <w:tc>
@@ -15400,6 +15592,9 @@
                 <w:szCs w:val="22"/>
               </w:rPr>
             </w:pPr>
+            <w:r>
+              <w:t>3 000</w:t>
+            </w:r>
           </w:p>
         </w:tc>
         <w:tc>
@@ -15422,6 +15617,9 @@
                 <w:szCs w:val="22"/>
               </w:rPr>
             </w:pPr>
+            <w:r>
+              <w:t>3 000</w:t>
+            </w:r>
           </w:p>
         </w:tc>
         <w:tc>
@@ -15444,6 +15642,9 @@
                 <w:szCs w:val="22"/>
               </w:rPr>
             </w:pPr>
+            <w:r>
+              <w:t>3 000</w:t>
+            </w:r>
           </w:p>
         </w:tc>
         <w:tc>
@@ -15466,6 +15667,9 @@
                 <w:szCs w:val="22"/>
               </w:rPr>
             </w:pPr>
+            <w:r>
+              <w:t>9 000</w:t>
+            </w:r>
           </w:p>
         </w:tc>
         <w:tc>
@@ -15488,6 +15692,15 @@
                 <w:szCs w:val="22"/>
               </w:rPr>
             </w:pPr>
+            <w:r>
+              <w:rPr>
+                <w:b/>
+              </w:rPr>
+              <w:rPr>
+                <w:b/>
+              </w:rPr>
+              <w:t>36 000</w:t>
+            </w:r>
           </w:p>
         </w:tc>
         <w:tc>
@@ -15510,6 +15723,9 @@
                 <w:szCs w:val="22"/>
               </w:rPr>
             </w:pPr>
+            <w:r>
+              <w:t>4,1</w:t>
+            </w:r>
           </w:p>
         </w:tc>
       </w:tr>
@@ -15999,7 +16215,7 @@
               </w:rPr>
             </w:pPr>
             <w:r>
-              <w:t>0</w:t>
+              <w:t>3 000</w:t>
             </w:r>
           </w:p>
         </w:tc>
@@ -16024,7 +16240,7 @@
               </w:rPr>
             </w:pPr>
             <w:r>
-              <w:t>0</w:t>
+              <w:t>3 000</w:t>
             </w:r>
           </w:p>
         </w:tc>
@@ -16049,7 +16265,7 @@
               </w:rPr>
             </w:pPr>
             <w:r>
-              <w:t>0</w:t>
+              <w:t>3 000</w:t>
             </w:r>
           </w:p>
         </w:tc>
@@ -16074,7 +16290,7 @@
               </w:rPr>
             </w:pPr>
             <w:r>
-              <w:t>0</w:t>
+              <w:t>3 000</w:t>
             </w:r>
           </w:p>
         </w:tc>
@@ -16124,7 +16340,7 @@
               </w:rPr>
             </w:pPr>
             <w:r>
-              <w:t>6 000</w:t>
+              <w:t>3 000</w:t>
             </w:r>
           </w:p>
         </w:tc>
@@ -16149,7 +16365,7 @@
               </w:rPr>
             </w:pPr>
             <w:r>
-              <w:t>6 000</w:t>
+              <w:t>3 000</w:t>
             </w:r>
           </w:p>
         </w:tc>
@@ -16274,7 +16490,7 @@
               </w:rPr>
             </w:pPr>
             <w:r>
-              <w:t>9 000</w:t>
+              <w:t>3 000</w:t>
             </w:r>
           </w:p>
         </w:tc>
@@ -16299,13 +16515,7 @@
               </w:rPr>
             </w:pPr>
             <w:r>
-              <w:rPr>
-                <w:b/>
-              </w:rPr>
-              <w:rPr>
-                <w:b/>
-              </w:rPr>
-              <w:t>36 000</w:t>
+              <w:t/>
             </w:r>
           </w:p>
         </w:tc>
@@ -16330,7 +16540,7 @@
               </w:rPr>
             </w:pPr>
             <w:r>
-              <w:t>4,1</w:t>
+              <w:t/>
             </w:r>
           </w:p>
         </w:tc>

</xml_diff>

<commit_message>
Fix: math aligned with Kuksov/Sizov pattern, trim texts, fix Solotcha
</commit_message>
<xml_diff>
--- a/Бизнес план Воробьев Павел Алексеевич FIX.docx
+++ b/Бизнес план Воробьев Павел Алексеевич FIX.docx
@@ -1674,7 +1674,7 @@
                 <w:sz w:val="28"/>
                 <w:szCs w:val="28"/>
               </w:rPr>
-              <w:t>552 956 руб.</w:t>
+              <w:t>550 806 руб.</w:t>
             </w:r>
           </w:p>
         </w:tc>
@@ -1726,7 +1726,7 @@
                 <w:sz w:val="28"/>
                 <w:szCs w:val="28"/>
               </w:rPr>
-              <w:t>323 544 руб.</w:t>
+              <w:t>325 694 руб.</w:t>
             </w:r>
           </w:p>
         </w:tc>
@@ -1778,7 +1778,7 @@
                 <w:sz w:val="28"/>
                 <w:szCs w:val="28"/>
               </w:rPr>
-              <w:t>693 440 руб.</w:t>
+              <w:t>695 590 руб.</w:t>
             </w:r>
           </w:p>
         </w:tc>
@@ -1830,7 +1830,7 @@
                 <w:sz w:val="28"/>
                 <w:szCs w:val="28"/>
               </w:rPr>
-              <w:t>58,5%</w:t>
+              <w:t>59,1%</w:t>
             </w:r>
           </w:p>
         </w:tc>
@@ -16574,7 +16574,7 @@
           <w:sz w:val="28"/>
           <w:szCs w:val="28"/>
         </w:rPr>
-        <w:t xml:space="preserve">Выручка в первый месяц (май) отсутствует — этот период полностью посвящён закупке оборудования, оформлению самозанятости, размещению объявлений на Авито и формированию портфолио. Со второго месяца начинается активная работа в высокий сезон: в июне–августе спрос на стандартный монтаж сплит-систем максимален (8–11 заказов в месяц). С сентября по ноябрь идёт плавный спад вместе с завершением летнего пика; структура заказов смещается на закладку трасс в новостройках г. Рязани, где I квартал 2026 г. — пик сдачи жилья. Январь — ожидаемо самый низкий месяц после новогодних праздников (3 заказа), но кассовых разрывов это не создаёт: выручка покрывает все текущие расходы, а накопленный за летний сезон чистый поток обеспечивает запас прочности. С марта–апреля начинается второй пик предсезонного спроса (ТО, чистка, демонтаж кондиционеров с дач) — клиенты заказывают обслуживание заранее, чтобы не стоять в очереди в мае–июне. Годовая выручка прогнозируется на уровне 876 500 руб., что соответствует средним показателям одобренных бизнес-планов в г. Рязани.</w:t>
+        <w:t xml:space="preserve">Выручка в первый месяц (май) отсутствует — этот период полностью посвящён закупке оборудования, оформлению самозанятости, размещению объявлений на Авито и формированию портфолио. Со второго месяца начинается активная работа в высокий сезон: в июне–августе спрос на стандартный монтаж сплит-систем максимален (8–11 заказов в месяц). С сентября по ноябрь идёт плавный спад; структура заказов смещается на закладку трасс в новостройках. Январь — самый низкий месяц после праздников (3 заказа), но кассовых разрывов нет: накопленный за лето чистый поток обеспечивает запас. С марта начинается второй пик (ТО, демонтаж) — клиенты заказывают заранее.</w:t>
       </w:r>
     </w:p>
     <w:p>
@@ -18116,7 +18116,7 @@
               </w:rPr>
             </w:pPr>
             <w:r>
-              <w:t>377 046</w:t>
+              <w:t>374 896</w:t>
             </w:r>
           </w:p>
         </w:tc>
@@ -18434,7 +18434,7 @@
               <w:rPr>
                 <w:b/>
               </w:rPr>
-              <w:t>552 956</w:t>
+              <w:t>550 806</w:t>
             </w:r>
           </w:p>
         </w:tc>
@@ -19764,7 +19764,7 @@
               </w:rPr>
             </w:pPr>
             <w:r>
-              <w:t>1 500</w:t>
+              <w:t>0</w:t>
             </w:r>
           </w:p>
         </w:tc>
@@ -20078,7 +20078,7 @@
             <w:r>
               <w:rPr/>
               <w:rPr/>
-              <w:t>33 900</w:t>
+              <w:t>32 400</w:t>
             </w:r>
           </w:p>
         </w:tc>
@@ -20175,7 +20175,7 @@
               </w:rPr>
             </w:pPr>
             <w:r>
-              <w:t>650</w:t>
+              <w:t>0</w:t>
             </w:r>
           </w:p>
         </w:tc>
@@ -20489,7 +20489,7 @@
             <w:r>
               <w:rPr/>
               <w:rPr/>
-              <w:t>7 800</w:t>
+              <w:t>7 150</w:t>
             </w:r>
           </w:p>
         </w:tc>
@@ -21819,7 +21819,7 @@
               </w:rPr>
             </w:pPr>
             <w:r>
-              <w:t>-377 046</w:t>
+              <w:t>-374 896</w:t>
             </w:r>
           </w:p>
         </w:tc>
@@ -22137,7 +22137,7 @@
               <w:rPr>
                 <w:b/>
               </w:rPr>
-              <w:t>323 544</w:t>
+              <w:t>325 694</w:t>
             </w:r>
           </w:p>
         </w:tc>
@@ -22265,7 +22265,7 @@
               </w:rPr>
             </w:pPr>
             <w:r>
-              <w:t>-7 150</w:t>
+              <w:t>-5 000</w:t>
             </w:r>
           </w:p>
         </w:tc>
@@ -22583,7 +22583,7 @@
               <w:rPr>
                 <w:b/>
               </w:rPr>
-              <w:t>693 440</w:t>
+              <w:t>695 590</w:t>
             </w:r>
           </w:p>
         </w:tc>
@@ -22681,7 +22681,7 @@
               </w:rPr>
             </w:pPr>
             <w:r>
-              <w:t>-7 150</w:t>
+              <w:t>-5 000</w:t>
             </w:r>
           </w:p>
         </w:tc>
@@ -22707,7 +22707,7 @@
               </w:rPr>
             </w:pPr>
             <w:r>
-              <w:t>92 300</w:t>
+              <w:t>94 450</w:t>
             </w:r>
           </w:p>
         </w:tc>
@@ -22733,7 +22733,7 @@
               </w:rPr>
             </w:pPr>
             <w:r>
-              <w:t>208 950</w:t>
+              <w:t>211 100</w:t>
             </w:r>
           </w:p>
         </w:tc>
@@ -22759,7 +22759,7 @@
               </w:rPr>
             </w:pPr>
             <w:r>
-              <w:t>310 640</w:t>
+              <w:t>312 790</w:t>
             </w:r>
           </w:p>
         </w:tc>
@@ -22785,7 +22785,7 @@
               </w:rPr>
             </w:pPr>
             <w:r>
-              <w:t>387 810</w:t>
+              <w:t>389 960</w:t>
             </w:r>
           </w:p>
         </w:tc>
@@ -22811,7 +22811,7 @@
               </w:rPr>
             </w:pPr>
             <w:r>
-              <w:t>440 360</w:t>
+              <w:t>442 510</w:t>
             </w:r>
           </w:p>
         </w:tc>
@@ -22837,7 +22837,7 @@
               </w:rPr>
             </w:pPr>
             <w:r>
-              <w:t>479 210</w:t>
+              <w:t>481 360</w:t>
             </w:r>
           </w:p>
         </w:tc>
@@ -22863,7 +22863,7 @@
               </w:rPr>
             </w:pPr>
             <w:r>
-              <w:t>507 580</w:t>
+              <w:t>509 730</w:t>
             </w:r>
           </w:p>
         </w:tc>
@@ -22889,7 +22889,7 @@
               </w:rPr>
             </w:pPr>
             <w:r>
-              <w:t>521 650</w:t>
+              <w:t>523 800</w:t>
             </w:r>
           </w:p>
         </w:tc>
@@ -22915,7 +22915,7 @@
               </w:rPr>
             </w:pPr>
             <w:r>
-              <w:t>536 980</w:t>
+              <w:t>539 130</w:t>
             </w:r>
           </w:p>
         </w:tc>
@@ -22941,7 +22941,7 @@
               </w:rPr>
             </w:pPr>
             <w:r>
-              <w:t>610 110</w:t>
+              <w:t>612 260</w:t>
             </w:r>
           </w:p>
         </w:tc>
@@ -22967,7 +22967,7 @@
               </w:rPr>
             </w:pPr>
             <w:r>
-              <w:t>693 440</w:t>
+              <w:t>695 590</w:t>
             </w:r>
           </w:p>
         </w:tc>
@@ -22999,7 +22999,7 @@
               <w:rPr>
                 <w:b/>
               </w:rPr>
-              <w:t>693 440</w:t>
+              <w:t>695 590</w:t>
             </w:r>
           </w:p>
         </w:tc>
@@ -23103,7 +23103,7 @@
               </w:rPr>
             </w:pPr>
             <w:r>
-              <w:t>-100%</w:t>
+              <w:t/>
             </w:r>
           </w:p>
         </w:tc>
@@ -23129,7 +23129,7 @@
               </w:rPr>
             </w:pPr>
             <w:r>
-              <w:t>551%</w:t>
+              <w:t/>
             </w:r>
           </w:p>
         </w:tc>
@@ -23155,7 +23155,7 @@
               </w:rPr>
             </w:pPr>
             <w:r>
-              <w:t>559%</w:t>
+              <w:t/>
             </w:r>
           </w:p>
         </w:tc>
@@ -23181,7 +23181,7 @@
               </w:rPr>
             </w:pPr>
             <w:r>
-              <w:t>513%</w:t>
+              <w:t/>
             </w:r>
           </w:p>
         </w:tc>
@@ -23207,7 +23207,7 @@
               </w:rPr>
             </w:pPr>
             <w:r>
-              <w:t>445%</w:t>
+              <w:t/>
             </w:r>
           </w:p>
         </w:tc>
@@ -23233,7 +23233,7 @@
               </w:rPr>
             </w:pPr>
             <w:r>
-              <w:t>352%</w:t>
+              <w:t/>
             </w:r>
           </w:p>
         </w:tc>
@@ -23259,7 +23259,7 @@
               </w:rPr>
             </w:pPr>
             <w:r>
-              <w:t>285%</w:t>
+              <w:t/>
             </w:r>
           </w:p>
         </w:tc>
@@ -23285,7 +23285,7 @@
               </w:rPr>
             </w:pPr>
             <w:r>
-              <w:t>255%</w:t>
+              <w:t/>
             </w:r>
           </w:p>
         </w:tc>
@@ -23311,7 +23311,7 @@
               </w:rPr>
             </w:pPr>
             <w:r>
-              <w:t>177%</w:t>
+              <w:t/>
             </w:r>
           </w:p>
         </w:tc>
@@ -23337,7 +23337,7 @@
               </w:rPr>
             </w:pPr>
             <w:r>
-              <w:t>151%</w:t>
+              <w:t/>
             </w:r>
           </w:p>
         </w:tc>
@@ -23363,7 +23363,7 @@
               </w:rPr>
             </w:pPr>
             <w:r>
-              <w:t>368%</w:t>
+              <w:t/>
             </w:r>
           </w:p>
         </w:tc>
@@ -23389,7 +23389,7 @@
               </w:rPr>
             </w:pPr>
             <w:r>
-              <w:t>376%</w:t>
+              <w:t/>
             </w:r>
           </w:p>
         </w:tc>
@@ -23421,7 +23421,7 @@
               <w:rPr>
                 <w:b/>
               </w:rPr>
-              <w:t>58,5%</w:t>
+              <w:t>59,1%</w:t>
             </w:r>
           </w:p>
         </w:tc>
@@ -24285,7 +24285,7 @@
           <w:sz w:val="28"/>
           <w:szCs w:val="28"/>
         </w:rPr>
-        <w:t xml:space="preserve">В первый месяц (май) расходы составляют 377 046 руб. — это закупка всего необходимого инструмента и стартовый рекламный пакет Авито. Расходы первого месяца полностью покрываются средствами социального контракта (350 000 руб.) и собственными вложениями автора (19 896 руб.), кассового разрыва нет. Со второго месяца расходы носят преимущественно динамический характер: расходные материалы (медные трубы, изоляция, химия для мойки) и транспортные расходы растут пропорционально количеству заказов, налог НПД 4% уплачивается по факту поступления выручки. Реклама плавающая по сезону: в летние пиковые месяцы достаточно базовой подписки на Авито (1 500 руб.), осенью и в предсезонье объём рекламы увеличивается до 3 500–5 000 руб. для удержания позиций. Постоянные ежемесячные расходы (телефон, интернет — 650 руб.) обеспечивают непрерывность связи с клиентами. В статью «непредвиденные расходы» заложены амортизация инструмента и резерв на ремонт. Аренда отсутствует — оборудование и материалы хранятся в собственном гараже автора.</w:t>
+        <w:t xml:space="preserve">В первый месяц (май) расходы составляют 374 896 руб. — это закупка всего необходимого инструмента и стартовый рекламный пакет Авито. Расходы первого месяца полностью покрываются средствами социального контракта (350 000 руб.) и собственными вложениями автора (19 896 руб.), кассового разрыва нет. Со второго месяца расходы носят преимущественно динамический характер: расходные материалы (медные трубы, изоляция, химия для мойки) и транспортные расходы растут пропорционально количеству заказов, налог НПД 4% уплачивается по факту поступления выручки. Реклама плавающая по сезону: в летние пиковые месяцы достаточно базовой подписки на Авито (1 500 руб.), осенью и в предсезонье объём увеличивается до 3 500–5 000 руб.</w:t>
       </w:r>
     </w:p>
     <w:p>
@@ -24665,7 +24665,7 @@
                 <w:sz w:val="28"/>
                 <w:szCs w:val="28"/>
               </w:rPr>
-              <w:t>552 956 руб.</w:t>
+              <w:t>550 806 руб.</w:t>
             </w:r>
           </w:p>
         </w:tc>
@@ -24690,7 +24690,7 @@
                 <w:sz w:val="28"/>
                 <w:szCs w:val="28"/>
               </w:rPr>
-              <w:t>276 213 руб.</w:t>
+              <w:t>273 955 руб.</w:t>
             </w:r>
           </w:p>
         </w:tc>
@@ -24771,7 +24771,7 @@
                 <w:sz w:val="28"/>
                 <w:szCs w:val="28"/>
               </w:rPr>
-              <w:t>323 544 руб.</w:t>
+              <w:t>325 694 руб.</w:t>
             </w:r>
           </w:p>
         </w:tc>
@@ -24796,7 +24796,7 @@
                 <w:sz w:val="28"/>
                 <w:szCs w:val="28"/>
               </w:rPr>
-              <w:t>673 787 руб.</w:t>
+              <w:t>676 045 руб.</w:t>
             </w:r>
           </w:p>
         </w:tc>
@@ -24877,7 +24877,7 @@
                 <w:sz w:val="28"/>
                 <w:szCs w:val="28"/>
               </w:rPr>
-              <w:t>58,5%</w:t>
+              <w:t>59,1%</w:t>
             </w:r>
           </w:p>
         </w:tc>
@@ -24902,7 +24902,7 @@
                 <w:sz w:val="28"/>
                 <w:szCs w:val="28"/>
               </w:rPr>
-              <w:t>244%</w:t>
+              <w:t>247%</w:t>
             </w:r>
           </w:p>
         </w:tc>

</xml_diff>

<commit_message>
Final fix: no ads in May, trim texts, Солотча, address=совпадает, full audit OK
Все 12 перекрёстных проверок пройдены:
- 1.16 = 5.2 = 5.4 (доходы/расходы/прибыль/рент) ✓
- 5.1 ИТОГО = 5.2 стр.1 ИТОГО = 876 500 ✓
- Прайс цены = 5.1 стоимость (10000/14000/5000/3500/3000) ✓
- 4.1 ИТОГО = Грант+Свои = Оборуд.5.2 = 369 896 ✓
- Прибыль = Доходы - Расходы = 330 694 ✓
- ЧДП = Прибыль + Грант + Свои = 700 590 ✓
- Рент = 60,6% ✓
- Май: доход=0, НПД=0, транспорт=0, телефон=0, реклама=0 ✓
- СОЛОТЧА → Солотча ✓
- Адрес факт → совпадает ✓
- Тексты: 5.1=417 сим, 5.2=425 сим ✓
- 7 рисков по 1 предложению ✓
</commit_message>
<xml_diff>
--- a/Бизнес план Воробьев Павел Алексеевич FIX.docx
+++ b/Бизнес план Воробьев Павел Алексеевич FIX.docx
@@ -480,7 +480,7 @@
           <w:szCs w:val="28"/>
           <w:lang w:eastAsia="en-US"/>
         </w:rPr>
-        <w:t xml:space="preserve">Рязанская обл., г. Рязань, ул. Гайдара (СОЛОТЧА), д. 3, кв. 8</w:t>
+        <w:t xml:space="preserve">Рязанская обл., г. Рязань, ул. Гайдара (Солотча), д. 3, кв. 8</w:t>
       </w:r>
     </w:p>
     <w:p>
@@ -983,7 +983,7 @@
           <w:sz w:val="28"/>
           <w:szCs w:val="28"/>
         </w:rPr>
-        <w:t xml:space="preserve">1.3. Адрес регистрации: Рязанская обл., г. Рязань, ул. Гайдара (СОЛОТЧА), д. 3, кв. 8.</w:t>
+        <w:t xml:space="preserve">1.3. Адрес регистрации: Рязанская обл., г. Рязань, ул. Гайдара (Солотча), д. 3, кв. 8.</w:t>
       </w:r>
     </w:p>
     <w:p>
@@ -1001,7 +1001,7 @@
           <w:sz w:val="28"/>
           <w:szCs w:val="28"/>
         </w:rPr>
-        <w:t xml:space="preserve">1.4. Адрес фактического проживания: Рязанская обл., г. Рязань, ул. Гайдара (СОЛОТЧА), д. 3, кв. 8</w:t>
+        <w:t xml:space="preserve">1.4. Адрес фактического проживания: совпадает с адресом регистрации.</w:t>
       </w:r>
     </w:p>
     <w:p>
@@ -1674,7 +1674,7 @@
                 <w:sz w:val="28"/>
                 <w:szCs w:val="28"/>
               </w:rPr>
-              <w:t>550 806 руб.</w:t>
+              <w:t>545 806 руб.</w:t>
             </w:r>
           </w:p>
         </w:tc>
@@ -1726,7 +1726,7 @@
                 <w:sz w:val="28"/>
                 <w:szCs w:val="28"/>
               </w:rPr>
-              <w:t>325 694 руб.</w:t>
+              <w:t>330 694 руб.</w:t>
             </w:r>
           </w:p>
         </w:tc>
@@ -1778,7 +1778,7 @@
                 <w:sz w:val="28"/>
                 <w:szCs w:val="28"/>
               </w:rPr>
-              <w:t>695 590 руб.</w:t>
+              <w:t>700 590 руб.</w:t>
             </w:r>
           </w:p>
         </w:tc>
@@ -1830,7 +1830,7 @@
                 <w:sz w:val="28"/>
                 <w:szCs w:val="28"/>
               </w:rPr>
-              <w:t>59,1%</w:t>
+              <w:t>60,6%</w:t>
             </w:r>
           </w:p>
         </w:tc>
@@ -16574,7 +16574,7 @@
           <w:sz w:val="28"/>
           <w:szCs w:val="28"/>
         </w:rPr>
-        <w:t xml:space="preserve">Выручка в первый месяц (май) отсутствует — этот период полностью посвящён закупке оборудования, оформлению самозанятости, размещению объявлений на Авито и формированию портфолио. Со второго месяца начинается активная работа в высокий сезон: в июне–августе спрос на стандартный монтаж сплит-систем максимален (8–11 заказов в месяц). С сентября по ноябрь идёт плавный спад; структура заказов смещается на закладку трасс в новостройках. Январь — самый низкий месяц после праздников (3 заказа), но кассовых разрывов нет: накопленный за лето чистый поток обеспечивает запас. С марта начинается второй пик (ТО, демонтаж) — клиенты заказывают заранее.</w:t>
+        <w:t xml:space="preserve">Выручка в первый месяц (май) отсутствует — этот период посвящён закупке оборудования, оформлению самозанятости и размещению объявлений на Авито. Со второго месяца начинается активная работа: в июне–августе спрос максимален (8–11 заказов). С сентября идёт спад, структура смещается на закладку трасс в новостройках. Январь — самый низкий месяц (3 заказа), но кассовых разрывов нет. С марта — второй пик (ТО, демонтаж).</w:t>
       </w:r>
     </w:p>
     <w:p>
@@ -18116,7 +18116,7 @@
               </w:rPr>
             </w:pPr>
             <w:r>
-              <w:t>374 896</w:t>
+              <w:t>369 896</w:t>
             </w:r>
           </w:p>
         </w:tc>
@@ -18434,7 +18434,7 @@
               <w:rPr>
                 <w:b/>
               </w:rPr>
-              <w:t>550 806</w:t>
+              <w:t>545 806</w:t>
             </w:r>
           </w:p>
         </w:tc>
@@ -20586,7 +20586,7 @@
               </w:rPr>
             </w:pPr>
             <w:r>
-              <w:t>5 000</w:t>
+              <w:t>0</w:t>
             </w:r>
           </w:p>
         </w:tc>
@@ -20900,7 +20900,7 @@
             <w:r>
               <w:rPr/>
               <w:rPr/>
-              <w:t>35 700</w:t>
+              <w:t>30 700</w:t>
             </w:r>
           </w:p>
         </w:tc>
@@ -21819,7 +21819,7 @@
               </w:rPr>
             </w:pPr>
             <w:r>
-              <w:t>-374 896</w:t>
+              <w:t>-369 896</w:t>
             </w:r>
           </w:p>
         </w:tc>
@@ -22137,7 +22137,7 @@
               <w:rPr>
                 <w:b/>
               </w:rPr>
-              <w:t>325 694</w:t>
+              <w:t>330 694</w:t>
             </w:r>
           </w:p>
         </w:tc>
@@ -22265,7 +22265,7 @@
               </w:rPr>
             </w:pPr>
             <w:r>
-              <w:t>-5 000</w:t>
+              <w:t>0</w:t>
             </w:r>
           </w:p>
         </w:tc>
@@ -22583,7 +22583,7 @@
               <w:rPr>
                 <w:b/>
               </w:rPr>
-              <w:t>695 590</w:t>
+              <w:t>700 590</w:t>
             </w:r>
           </w:p>
         </w:tc>
@@ -22681,7 +22681,7 @@
               </w:rPr>
             </w:pPr>
             <w:r>
-              <w:t>-5 000</w:t>
+              <w:t>0</w:t>
             </w:r>
           </w:p>
         </w:tc>
@@ -22707,7 +22707,7 @@
               </w:rPr>
             </w:pPr>
             <w:r>
-              <w:t>94 450</w:t>
+              <w:t>99 450</w:t>
             </w:r>
           </w:p>
         </w:tc>
@@ -22733,7 +22733,7 @@
               </w:rPr>
             </w:pPr>
             <w:r>
-              <w:t>211 100</w:t>
+              <w:t>216 100</w:t>
             </w:r>
           </w:p>
         </w:tc>
@@ -22759,7 +22759,7 @@
               </w:rPr>
             </w:pPr>
             <w:r>
-              <w:t>312 790</w:t>
+              <w:t>317 790</w:t>
             </w:r>
           </w:p>
         </w:tc>
@@ -22785,7 +22785,7 @@
               </w:rPr>
             </w:pPr>
             <w:r>
-              <w:t>389 960</w:t>
+              <w:t>394 960</w:t>
             </w:r>
           </w:p>
         </w:tc>
@@ -22811,7 +22811,7 @@
               </w:rPr>
             </w:pPr>
             <w:r>
-              <w:t>442 510</w:t>
+              <w:t>447 510</w:t>
             </w:r>
           </w:p>
         </w:tc>
@@ -22837,7 +22837,7 @@
               </w:rPr>
             </w:pPr>
             <w:r>
-              <w:t>481 360</w:t>
+              <w:t>486 360</w:t>
             </w:r>
           </w:p>
         </w:tc>
@@ -22863,7 +22863,7 @@
               </w:rPr>
             </w:pPr>
             <w:r>
-              <w:t>509 730</w:t>
+              <w:t>514 730</w:t>
             </w:r>
           </w:p>
         </w:tc>
@@ -22889,7 +22889,7 @@
               </w:rPr>
             </w:pPr>
             <w:r>
-              <w:t>523 800</w:t>
+              <w:t>528 800</w:t>
             </w:r>
           </w:p>
         </w:tc>
@@ -22915,7 +22915,7 @@
               </w:rPr>
             </w:pPr>
             <w:r>
-              <w:t>539 130</w:t>
+              <w:t>544 130</w:t>
             </w:r>
           </w:p>
         </w:tc>
@@ -22941,7 +22941,7 @@
               </w:rPr>
             </w:pPr>
             <w:r>
-              <w:t>612 260</w:t>
+              <w:t>617 260</w:t>
             </w:r>
           </w:p>
         </w:tc>
@@ -22967,7 +22967,7 @@
               </w:rPr>
             </w:pPr>
             <w:r>
-              <w:t>695 590</w:t>
+              <w:t>700 590</w:t>
             </w:r>
           </w:p>
         </w:tc>
@@ -22999,7 +22999,7 @@
               <w:rPr>
                 <w:b/>
               </w:rPr>
-              <w:t>695 590</w:t>
+              <w:t>700 590</w:t>
             </w:r>
           </w:p>
         </w:tc>
@@ -23421,7 +23421,7 @@
               <w:rPr>
                 <w:b/>
               </w:rPr>
-              <w:t>59,1%</w:t>
+              <w:t>60,6%</w:t>
             </w:r>
           </w:p>
         </w:tc>
@@ -24285,7 +24285,7 @@
           <w:sz w:val="28"/>
           <w:szCs w:val="28"/>
         </w:rPr>
-        <w:t xml:space="preserve">В первый месяц (май) расходы составляют 374 896 руб. — это закупка всего необходимого инструмента и стартовый рекламный пакет Авито. Расходы первого месяца полностью покрываются средствами социального контракта (350 000 руб.) и собственными вложениями автора (19 896 руб.), кассового разрыва нет. Со второго месяца расходы носят преимущественно динамический характер: расходные материалы (медные трубы, изоляция, химия для мойки) и транспортные расходы растут пропорционально количеству заказов, налог НПД 4% уплачивается по факту поступления выручки. Реклама плавающая по сезону: в летние пиковые месяцы достаточно базовой подписки на Авито (1 500 руб.), осенью и в предсезонье объём увеличивается до 3 500–5 000 руб.</w:t>
+        <w:t xml:space="preserve">В первый месяц (май) расходы составляют 369 896 руб. — это закупка всего необходимого инструмента. Расходы полностью покрываются средствами социального контракта (350 000 руб.) и собственными вложениями (19 896 руб.), кассового разрыва нет. Со второго месяца расходные материалы и транспорт растут пропорционально заказам, НПД 4% уплачивается по факту выручки. Реклама плавающая: летом 1 500 руб., в предсезонье до 5 000 руб.</w:t>
       </w:r>
     </w:p>
     <w:p>
@@ -24665,7 +24665,7 @@
                 <w:sz w:val="28"/>
                 <w:szCs w:val="28"/>
               </w:rPr>
-              <w:t>550 806 руб.</w:t>
+              <w:t>545 806 руб.</w:t>
             </w:r>
           </w:p>
         </w:tc>
@@ -24690,7 +24690,7 @@
                 <w:sz w:val="28"/>
                 <w:szCs w:val="28"/>
               </w:rPr>
-              <w:t>273 955 руб.</w:t>
+              <w:t>268 705 руб.</w:t>
             </w:r>
           </w:p>
         </w:tc>
@@ -24771,7 +24771,7 @@
                 <w:sz w:val="28"/>
                 <w:szCs w:val="28"/>
               </w:rPr>
-              <w:t>325 694 руб.</w:t>
+              <w:t>330 694 руб.</w:t>
             </w:r>
           </w:p>
         </w:tc>
@@ -24796,7 +24796,7 @@
                 <w:sz w:val="28"/>
                 <w:szCs w:val="28"/>
               </w:rPr>
-              <w:t>676 045 руб.</w:t>
+              <w:t>681 295 руб.</w:t>
             </w:r>
           </w:p>
         </w:tc>
@@ -24877,7 +24877,7 @@
                 <w:sz w:val="28"/>
                 <w:szCs w:val="28"/>
               </w:rPr>
-              <w:t>59,1%</w:t>
+              <w:t>60,6%</w:t>
             </w:r>
           </w:p>
         </w:tc>
@@ -24902,7 +24902,7 @@
                 <w:sz w:val="28"/>
                 <w:szCs w:val="28"/>
               </w:rPr>
-              <w:t>247%</w:t>
+              <w:t>254%</w:t>
             </w:r>
           </w:p>
         </w:tc>

</xml_diff>